<commit_message>
docs: correct delivery and publish guidance
</commit_message>
<xml_diff>
--- a/docs/Hunter_Craftsman_部署配置及问题处理说明.docx
+++ b/docs/Hunter_Craftsman_部署配置及问题处理说明.docx
@@ -36,7 +36,7 @@
           <w:rFonts w:ascii="Calibri" w:hAnsi="Calibri" w:eastAsia="Microsoft YaHei"/>
           <w:sz w:val="21"/>
         </w:rPr>
-        <w:t>版本日期：2026-07-12</w:t>
+        <w:t>版本日期：2026-07-14</w:t>
       </w:r>
     </w:p>
     <w:p/>
@@ -481,7 +481,7 @@
           <w:rFonts w:ascii="Calibri" w:hAnsi="Calibri" w:eastAsia="Microsoft YaHei"/>
           <w:b w:val="0"/>
         </w:rPr>
-        <w:t>当前推荐方案中，不需要额外单独启动独立 UI 服务或独立 Gateway 服务。Dashboard 已由 Craftsman 统一提供。</w:t>
+        <w:t>当前交付分支中，不需要额外单独启动独立 UI 服务或独立 Gateway 服务。Dashboard 已由 Craftsman 统一提供。 如查看仓库历史，可能会看到更早的 `dashboard/gateway`、`dashboard/ui` 目录；它们不属于本次交付基线。</w:t>
       </w:r>
     </w:p>
     <w:p>
@@ -1203,6 +1203,15 @@
           <w:sz w:val="19"/>
         </w:rPr>
         <w:t>RestartSec=5</w:t>
+      </w:r>
+    </w:p>
+    <w:p>
+      <w:r>
+        <w:rPr>
+          <w:rFonts w:ascii="Calibri" w:hAnsi="Calibri" w:eastAsia="Microsoft YaHei"/>
+          <w:b w:val="0"/>
+        </w:rPr>
+        <w:t>仓库自带的 `docker/systemd/craftsman.service` 示例当前使用 `--host 0.0.0.0`。 如果线上采用 Nginx 反向代理，建议在正式部署时改为 `127.0.0.1`，避免直接暴露服务端口。</w:t>
       </w:r>
     </w:p>
     <w:p>

</xml_diff>

<commit_message>
docs: align startup guidance with verified flow
</commit_message>
<xml_diff>
--- a/docs/Hunter_Craftsman_部署配置及问题处理说明.docx
+++ b/docs/Hunter_Craftsman_部署配置及问题处理说明.docx
@@ -36,7 +36,7 @@
           <w:rFonts w:ascii="Calibri" w:hAnsi="Calibri" w:eastAsia="Microsoft YaHei"/>
           <w:sz w:val="21"/>
         </w:rPr>
-        <w:t>版本日期：2026-07-14</w:t>
+        <w:t>版本日期：2026-07-15</w:t>
       </w:r>
     </w:p>
     <w:p/>
@@ -1058,7 +1058,7 @@
           <w:rFonts w:ascii="Calibri" w:hAnsi="Calibri" w:eastAsia="Microsoft YaHei"/>
           <w:b w:val="0"/>
         </w:rPr>
-        <w:t>推荐先启动 Craftsman，再触发 Hunter。Hunter 是触发器，Craftsman 是长期运行的服务端。</w:t>
+        <w:t>推荐先启动 Craftsman，再触发 Hunter。Hunter 是触发器，Craftsman 是长期运行的服务端。部署时建议使用仓库根目录的共享虚拟环境，并在同一个环境中同时安装 Craftsman、Craftsman 发布依赖和 Hunter。</w:t>
       </w:r>
     </w:p>
     <w:p>
@@ -1107,6 +1107,15 @@
           <w:sz w:val="19"/>
         </w:rPr>
         <w:t>python -m craftsman.cli serve --host 127.0.0.1 --port 8791</w:t>
+      </w:r>
+    </w:p>
+    <w:p>
+      <w:r>
+        <w:rPr>
+          <w:rFonts w:ascii="Calibri" w:hAnsi="Calibri" w:eastAsia="Microsoft YaHei"/>
+          <w:b w:val="0"/>
+        </w:rPr>
+        <w:t>如果仅在 `craftsman/` 子目录单独创建虚拟环境，而没有把 `hunter` 也安装进同一个环境，后续 `hunter autopilot` 将无法正常运行。因此交付环境建议统一使用仓库根目录共享 `.venv`。</w:t>
       </w:r>
     </w:p>
     <w:p>

</xml_diff>

<commit_message>
Fix explicit proxy handling for delivery
</commit_message>
<xml_diff>
--- a/docs/Hunter_Craftsman_部署配置及问题处理说明.docx
+++ b/docs/Hunter_Craftsman_部署配置及问题处理说明.docx
@@ -1042,6 +1042,24 @@
           <w:b w:val="0"/>
         </w:rPr>
         <w:t>4. 真实密钥、service account JSON、keystore、数据库和 workspace 不建议上传至代码仓库。</w:t>
+      </w:r>
+    </w:p>
+    <w:p>
+      <w:r>
+        <w:rPr>
+          <w:rFonts w:ascii="Calibri" w:hAnsi="Calibri" w:eastAsia="Microsoft YaHei"/>
+          <w:b w:val="0"/>
+        </w:rPr>
+        <w:t>5. 代理不是必填项。只有当部署服务器访问 Google Play、Google Publisher API、DeepSeek 或 Tavily 必须经过代理时，才需要显式设置 HTTP_PROXY / HTTPS_PROXY；如果服务器本身能够直连外网，则不需要配置代理。</w:t>
+      </w:r>
+    </w:p>
+    <w:p>
+      <w:r>
+        <w:rPr>
+          <w:rFonts w:ascii="Calibri" w:hAnsi="Calibri" w:eastAsia="Microsoft YaHei"/>
+          <w:b w:val="0"/>
+        </w:rPr>
+        <w:t>6. 代理地址指的是服务器本机出网代理地址，不是需要对外开放的访问端口。</w:t>
       </w:r>
     </w:p>
     <w:p>

</xml_diff>